<commit_message>
Fájlstruktúra, navbar, footer, bootstrap implementálás, template létrehozása
létrehoztam minden html fájlt, képek, css, scriptek strukturálása, navbar és footer elkészítése, betölthető minden oldalon. Template mappában található az alap oldalszerkezet, csak ki kell másolni és be kell illeszteni minden oldalra kiindulásként.
</commit_message>
<xml_diff>
--- a/dokumentumok/Informaciok.docx
+++ b/dokumentumok/Informaciok.docx
@@ -4,7 +4,7 @@
   <w:body>
     <w:tbl>
       <w:tblPr>
-        <w:tblStyle w:val="TableGrid"/>
+        <w:tblStyle w:val="Rcsostblzat"/>
         <w:tblW w:w="0" w:type="auto"/>
         <w:tblLook w:val="04A0" w:firstRow="1" w:lastRow="0" w:firstColumn="1" w:lastColumn="0" w:noHBand="0" w:noVBand="1"/>
       </w:tblPr>
@@ -27,7 +27,20 @@
           <w:tcPr>
             <w:tcW w:w="4531" w:type="dxa"/>
           </w:tcPr>
-          <w:p/>
+          <w:p>
+            <w:r>
+              <w:t>19363020</w:t>
+            </w:r>
+            <w:r>
+              <w:t>-1-06</w:t>
+            </w:r>
+            <w:r>
+              <w:rPr>
+                <w:rFonts w:ascii="Segoe UI Emoji" w:hAnsi="Segoe UI Emoji" w:cs="Segoe UI Emoji"/>
+              </w:rPr>
+              <w:t>✅</w:t>
+            </w:r>
+          </w:p>
         </w:tc>
       </w:tr>
       <w:tr>
@@ -45,7 +58,23 @@
           <w:tcPr>
             <w:tcW w:w="4531" w:type="dxa"/>
           </w:tcPr>
-          <w:p/>
+          <w:p>
+            <w:r>
+              <w:t>50468232-10014516</w:t>
+            </w:r>
+            <w:r>
+              <w:t xml:space="preserve"> </w:t>
+            </w:r>
+            <w:r>
+              <w:t>MBH Bank Nyilvánosan Működő Részvénytársaság</w:t>
+            </w:r>
+            <w:r>
+              <w:rPr>
+                <w:rFonts w:ascii="Segoe UI Emoji" w:hAnsi="Segoe UI Emoji" w:cs="Segoe UI Emoji"/>
+              </w:rPr>
+              <w:t>✅</w:t>
+            </w:r>
+          </w:p>
         </w:tc>
       </w:tr>
       <w:tr>
@@ -63,7 +92,17 @@
           <w:tcPr>
             <w:tcW w:w="4531" w:type="dxa"/>
           </w:tcPr>
-          <w:p/>
+          <w:p>
+            <w:r>
+              <w:t>+3630 1525797</w:t>
+            </w:r>
+            <w:r>
+              <w:rPr>
+                <w:rFonts w:ascii="Segoe UI Emoji" w:hAnsi="Segoe UI Emoji" w:cs="Segoe UI Emoji"/>
+              </w:rPr>
+              <w:t>✅</w:t>
+            </w:r>
+          </w:p>
         </w:tc>
       </w:tr>
       <w:tr>
@@ -81,7 +120,17 @@
           <w:tcPr>
             <w:tcW w:w="4531" w:type="dxa"/>
           </w:tcPr>
-          <w:p/>
+          <w:p>
+            <w:r>
+              <w:t>napfenyszigetalapitvany@gmail.com</w:t>
+            </w:r>
+            <w:r>
+              <w:rPr>
+                <w:rFonts w:ascii="Segoe UI Emoji" w:hAnsi="Segoe UI Emoji" w:cs="Segoe UI Emoji"/>
+              </w:rPr>
+              <w:t>✅</w:t>
+            </w:r>
+          </w:p>
         </w:tc>
       </w:tr>
       <w:tr>
@@ -99,7 +148,23 @@
           <w:tcPr>
             <w:tcW w:w="4531" w:type="dxa"/>
           </w:tcPr>
-          <w:p/>
+          <w:p>
+            <w:r>
+              <w:t>6800 Hódmezővásárhely, Szántó Kovács János u. 87.</w:t>
+            </w:r>
+            <w:r>
+              <w:rPr>
+                <w:rFonts w:ascii="Segoe UI Emoji" w:hAnsi="Segoe UI Emoji" w:cs="Segoe UI Emoji"/>
+              </w:rPr>
+              <w:t xml:space="preserve"> </w:t>
+            </w:r>
+            <w:r>
+              <w:rPr>
+                <w:rFonts w:ascii="Segoe UI Emoji" w:hAnsi="Segoe UI Emoji" w:cs="Segoe UI Emoji"/>
+              </w:rPr>
+              <w:t>✅</w:t>
+            </w:r>
+          </w:p>
         </w:tc>
       </w:tr>
       <w:tr>
@@ -109,15 +174,25 @@
           </w:tcPr>
           <w:p>
             <w:r>
-              <w:t>levelezoi cim (ha van)</w:t>
-            </w:r>
-          </w:p>
-        </w:tc>
-        <w:tc>
-          <w:tcPr>
-            <w:tcW w:w="4531" w:type="dxa"/>
-          </w:tcPr>
-          <w:p/>
+              <w:t>milyen social platformon vagtok fent? (pl tiktok, facebook, insta stb)</w:t>
+            </w:r>
+          </w:p>
+        </w:tc>
+        <w:tc>
+          <w:tcPr>
+            <w:tcW w:w="4531" w:type="dxa"/>
+          </w:tcPr>
+          <w:p>
+            <w:r>
+              <w:t>fb</w:t>
+            </w:r>
+            <w:r>
+              <w:rPr>
+                <w:rFonts w:ascii="Segoe UI Emoji" w:hAnsi="Segoe UI Emoji" w:cs="Segoe UI Emoji"/>
+              </w:rPr>
+              <w:t>✅</w:t>
+            </w:r>
+          </w:p>
         </w:tc>
       </w:tr>
       <w:tr>
@@ -127,15 +202,28 @@
           </w:tcPr>
           <w:p>
             <w:r>
-              <w:t>milyen social platformon vagtok fent? (pl tiktok, facebook, insta stb)</w:t>
-            </w:r>
-          </w:p>
-        </w:tc>
-        <w:tc>
-          <w:tcPr>
-            <w:tcW w:w="4531" w:type="dxa"/>
-          </w:tcPr>
-          <w:p/>
+              <w:t>alapitvany pontos neve</w:t>
+            </w:r>
+          </w:p>
+        </w:tc>
+        <w:tc>
+          <w:tcPr>
+            <w:tcW w:w="4531" w:type="dxa"/>
+          </w:tcPr>
+          <w:p>
+            <w:r>
+              <w:t>N</w:t>
+            </w:r>
+            <w:r>
+              <w:t>apfénysziget Rehabilitációs és Szociális Alapítvány</w:t>
+            </w:r>
+            <w:r>
+              <w:rPr>
+                <w:rFonts w:ascii="Segoe UI Emoji" w:hAnsi="Segoe UI Emoji" w:cs="Segoe UI Emoji"/>
+              </w:rPr>
+              <w:t>✅</w:t>
+            </w:r>
+          </w:p>
         </w:tc>
       </w:tr>
       <w:tr>
@@ -145,15 +233,28 @@
           </w:tcPr>
           <w:p>
             <w:r>
-              <w:t>alapitvany pontos neve</w:t>
-            </w:r>
-          </w:p>
-        </w:tc>
-        <w:tc>
-          <w:tcPr>
-            <w:tcW w:w="4531" w:type="dxa"/>
-          </w:tcPr>
-          <w:p/>
+              <w:t>bí</w:t>
+            </w:r>
+            <w:r>
+              <w:t>rosagi nyilvantartasi szam (fogalmam sincs miez)</w:t>
+            </w:r>
+          </w:p>
+        </w:tc>
+        <w:tc>
+          <w:tcPr>
+            <w:tcW w:w="4531" w:type="dxa"/>
+          </w:tcPr>
+          <w:p>
+            <w:r>
+              <w:t>06-01-0001807</w:t>
+            </w:r>
+            <w:r>
+              <w:rPr>
+                <w:rFonts w:ascii="Segoe UI Emoji" w:hAnsi="Segoe UI Emoji" w:cs="Segoe UI Emoji"/>
+              </w:rPr>
+              <w:t>✅</w:t>
+            </w:r>
+          </w:p>
         </w:tc>
       </w:tr>
       <w:tr>
@@ -163,7 +264,7 @@
           </w:tcPr>
           <w:p>
             <w:r>
-              <w:t>pirosagi nyilvantartasi szam (fogalmam sincs miez)</w:t>
+              <w:t>támokatóink</w:t>
             </w:r>
           </w:p>
         </w:tc>
@@ -181,38 +282,24 @@
           </w:tcPr>
           <w:p>
             <w:r>
-              <w:t>támokatóink</w:t>
-            </w:r>
-          </w:p>
-        </w:tc>
-        <w:tc>
-          <w:tcPr>
-            <w:tcW w:w="4531" w:type="dxa"/>
-          </w:tcPr>
-          <w:p/>
+              <w:t>tevékenységünk (képekben és pontokban ? (két külön oldal lehet, vagy akar egy oldalra is feltuntethetjuk)</w:t>
+            </w:r>
+          </w:p>
+        </w:tc>
+        <w:tc>
+          <w:tcPr>
+            <w:tcW w:w="4531" w:type="dxa"/>
+          </w:tcPr>
+          <w:p>
+            <w:r>
+              <w:t>szociális tevékenység - esélyegyenlőség elősegítése - hátrányos helyzetben lévők rehabilitációs tanácsadása - hátrányos helyzetben lévők rehabilitációs foglalkoztatása - a hátrányos helyzetben lévő egyének társasalomba való beilleszkedésének elősegítése - a munkapiacon hátrányos helyzetű rétegek képzésének elősegítése az egyéni szükségleteik figyelembevételével - hátrányos helyzetű rétegek szabadidős programjainak biztosítása, programok szervezése - hátrányos helyzetű rétegek szociális ellátáshoz kapcsolódó feladataiban való részvétel</w:t>
+            </w:r>
+          </w:p>
         </w:tc>
       </w:tr>
       <w:tr>
         <w:tc>
           <w:tcPr>
-            <w:tcW w:w="4531" w:type="dxa"/>
-          </w:tcPr>
-          <w:p>
-            <w:r>
-              <w:t>tevékenységünk (képekben és pontokban ? (két külön oldal lehet, vagy akar egy oldalra is feltuntethetjuk)</w:t>
-            </w:r>
-          </w:p>
-        </w:tc>
-        <w:tc>
-          <w:tcPr>
-            <w:tcW w:w="4531" w:type="dxa"/>
-          </w:tcPr>
-          <w:p/>
-        </w:tc>
-      </w:tr>
-      <w:tr>
-        <w:tc>
-          <w:tcPr>
             <w:tcW w:w="9062" w:type="dxa"/>
             <w:gridSpan w:val="2"/>
           </w:tcPr>
@@ -220,10 +307,10 @@
             <w:r>
               <w:t xml:space="preserve">Bemutatkozás szöveget egy külön word doksiba (pl </w:t>
             </w:r>
-            <w:hyperlink r:id="rId4" w:history="1">
+            <w:hyperlink r:id="rId5" w:history="1">
               <w:r>
                 <w:rPr>
-                  <w:rStyle w:val="Hyperlink"/>
+                  <w:rStyle w:val="Hiperhivatkozs"/>
                 </w:rPr>
                 <w:t>https://www.daganatos.hu/alapitvanyrol/bemutatkozas</w:t>
               </w:r>
@@ -261,6 +348,65 @@
         </w:tc>
       </w:tr>
     </w:tbl>
+    <w:p>
+      <w:r>
+        <w:t>Fő tevékenységeik és céljaik közé tartozik:</w:t>
+      </w:r>
+    </w:p>
+    <w:p>
+      <w:pPr>
+        <w:numPr>
+          <w:ilvl w:val="0"/>
+          <w:numId w:val="1"/>
+        </w:numPr>
+      </w:pPr>
+      <w:r>
+        <w:rPr>
+          <w:b/>
+          <w:bCs/>
+        </w:rPr>
+        <w:t>Gyermekek támogatása:</w:t>
+      </w:r>
+      <w:r>
+        <w:t xml:space="preserve"> Rendszeresen segítenek hátrányos helyzetű, nehéz sorsú családokon.</w:t>
+      </w:r>
+    </w:p>
+    <w:p>
+      <w:pPr>
+        <w:numPr>
+          <w:ilvl w:val="0"/>
+          <w:numId w:val="1"/>
+        </w:numPr>
+      </w:pPr>
+      <w:r>
+        <w:rPr>
+          <w:b/>
+          <w:bCs/>
+        </w:rPr>
+        <w:t>Közösségi programok:</w:t>
+      </w:r>
+      <w:r>
+        <w:t xml:space="preserve"> Céljaik elérése érdekében jótékonysági rendezvényeket (pl. jótékonysági futóversenyeket) szerveznek.</w:t>
+      </w:r>
+    </w:p>
+    <w:p>
+      <w:pPr>
+        <w:numPr>
+          <w:ilvl w:val="0"/>
+          <w:numId w:val="1"/>
+        </w:numPr>
+      </w:pPr>
+      <w:r>
+        <w:rPr>
+          <w:b/>
+          <w:bCs/>
+        </w:rPr>
+        <w:t>Rehabilitáció és szociális segítségnyújtás:</w:t>
+      </w:r>
+      <w:r>
+        <w:t xml:space="preserve"> Támogatást nyújtanak a rászorulóknak és a társadalmi integráció elősegítésében</w:t>
+      </w:r>
+    </w:p>
     <w:p/>
     <w:sectPr>
       <w:pgSz w:w="11906" w:h="16838"/>
@@ -270,6 +416,163 @@
     </w:sectPr>
   </w:body>
 </w:document>
+</file>
+
+<file path=word/numbering.xml><?xml version="1.0" encoding="utf-8"?>
+<w:numbering xmlns:wpc="http://schemas.microsoft.com/office/word/2010/wordprocessingCanvas" xmlns:cx="http://schemas.microsoft.com/office/drawing/2014/chartex" xmlns:cx1="http://schemas.microsoft.com/office/drawing/2015/9/8/chartex" xmlns:cx2="http://schemas.microsoft.com/office/drawing/2015/10/21/chartex" xmlns:cx3="http://schemas.microsoft.com/office/drawing/2016/5/9/chartex" xmlns:cx4="http://schemas.microsoft.com/office/drawing/2016/5/10/chartex" xmlns:cx5="http://schemas.microsoft.com/office/drawing/2016/5/11/chartex" xmlns:cx6="http://schemas.microsoft.com/office/drawing/2016/5/12/chartex" xmlns:cx7="http://schemas.microsoft.com/office/drawing/2016/5/13/chartex" xmlns:cx8="http://schemas.microsoft.com/office/drawing/2016/5/14/chartex" xmlns:mc="http://schemas.openxmlformats.org/markup-compatibility/2006" xmlns:aink="http://schemas.microsoft.com/office/drawing/2016/ink" xmlns:am3d="http://schemas.microsoft.com/office/drawing/2017/model3d" xmlns:o="urn:schemas-microsoft-com:office:office" xmlns:oel="http://schemas.microsoft.com/office/2019/extlst" xmlns:r="http://schemas.openxmlformats.org/officeDocument/2006/relationships" xmlns:m="http://schemas.openxmlformats.org/officeDocument/2006/math" xmlns:v="urn:schemas-microsoft-com:vml" xmlns:wp14="http://schemas.microsoft.com/office/word/2010/wordprocessingDrawing" xmlns:wp="http://schemas.openxmlformats.org/drawingml/2006/wordprocessingDrawing" xmlns:w10="urn:schemas-microsoft-com:office:word" xmlns:w="http://schemas.openxmlformats.org/wordprocessingml/2006/main" xmlns:w14="http://schemas.microsoft.com/office/word/2010/wordml" xmlns:w15="http://schemas.microsoft.com/office/word/2012/wordml" xmlns:w16cex="http://schemas.microsoft.com/office/word/2018/wordml/cex" xmlns:w16cid="http://schemas.microsoft.com/office/word/2016/wordml/cid" xmlns:w16="http://schemas.microsoft.com/office/word/2018/wordml" xmlns:w16du="http://schemas.microsoft.com/office/word/2023/wordml/word16du" xmlns:w16sdtdh="http://schemas.microsoft.com/office/word/2020/wordml/sdtdatahash" xmlns:w16sdtfl="http://schemas.microsoft.com/office/word/2024/wordml/sdtformatlock" xmlns:w16se="http://schemas.microsoft.com/office/word/2015/wordml/symex" xmlns:wpg="http://schemas.microsoft.com/office/word/2010/wordprocessingGroup" xmlns:wpi="http://schemas.microsoft.com/office/word/2010/wordprocessingInk" xmlns:wne="http://schemas.microsoft.com/office/word/2006/wordml" xmlns:wps="http://schemas.microsoft.com/office/word/2010/wordprocessingShape" mc:Ignorable="w14 w15 w16se w16cid w16 w16cex w16sdtdh w16sdtfl w16du wp14">
+  <w:abstractNum w:abstractNumId="0" w15:restartNumberingAfterBreak="0">
+    <w:nsid w:val="3027121E"/>
+    <w:multiLevelType w:val="multilevel"/>
+    <w:tmpl w:val="8B26A44A"/>
+    <w:lvl w:ilvl="0">
+      <w:start w:val="1"/>
+      <w:numFmt w:val="bullet"/>
+      <w:lvlText w:val=""/>
+      <w:lvlJc w:val="left"/>
+      <w:pPr>
+        <w:tabs>
+          <w:tab w:val="num" w:pos="720"/>
+        </w:tabs>
+        <w:ind w:left="720" w:hanging="360"/>
+      </w:pPr>
+      <w:rPr>
+        <w:rFonts w:ascii="Symbol" w:hAnsi="Symbol" w:hint="default"/>
+        <w:sz w:val="20"/>
+      </w:rPr>
+    </w:lvl>
+    <w:lvl w:ilvl="1" w:tentative="1">
+      <w:start w:val="1"/>
+      <w:numFmt w:val="bullet"/>
+      <w:lvlText w:val="o"/>
+      <w:lvlJc w:val="left"/>
+      <w:pPr>
+        <w:tabs>
+          <w:tab w:val="num" w:pos="1440"/>
+        </w:tabs>
+        <w:ind w:left="1440" w:hanging="360"/>
+      </w:pPr>
+      <w:rPr>
+        <w:rFonts w:ascii="Courier New" w:hAnsi="Courier New" w:hint="default"/>
+        <w:sz w:val="20"/>
+      </w:rPr>
+    </w:lvl>
+    <w:lvl w:ilvl="2" w:tentative="1">
+      <w:start w:val="1"/>
+      <w:numFmt w:val="bullet"/>
+      <w:lvlText w:val=""/>
+      <w:lvlJc w:val="left"/>
+      <w:pPr>
+        <w:tabs>
+          <w:tab w:val="num" w:pos="2160"/>
+        </w:tabs>
+        <w:ind w:left="2160" w:hanging="360"/>
+      </w:pPr>
+      <w:rPr>
+        <w:rFonts w:ascii="Wingdings" w:hAnsi="Wingdings" w:hint="default"/>
+        <w:sz w:val="20"/>
+      </w:rPr>
+    </w:lvl>
+    <w:lvl w:ilvl="3" w:tentative="1">
+      <w:start w:val="1"/>
+      <w:numFmt w:val="bullet"/>
+      <w:lvlText w:val=""/>
+      <w:lvlJc w:val="left"/>
+      <w:pPr>
+        <w:tabs>
+          <w:tab w:val="num" w:pos="2880"/>
+        </w:tabs>
+        <w:ind w:left="2880" w:hanging="360"/>
+      </w:pPr>
+      <w:rPr>
+        <w:rFonts w:ascii="Wingdings" w:hAnsi="Wingdings" w:hint="default"/>
+        <w:sz w:val="20"/>
+      </w:rPr>
+    </w:lvl>
+    <w:lvl w:ilvl="4" w:tentative="1">
+      <w:start w:val="1"/>
+      <w:numFmt w:val="bullet"/>
+      <w:lvlText w:val=""/>
+      <w:lvlJc w:val="left"/>
+      <w:pPr>
+        <w:tabs>
+          <w:tab w:val="num" w:pos="3600"/>
+        </w:tabs>
+        <w:ind w:left="3600" w:hanging="360"/>
+      </w:pPr>
+      <w:rPr>
+        <w:rFonts w:ascii="Wingdings" w:hAnsi="Wingdings" w:hint="default"/>
+        <w:sz w:val="20"/>
+      </w:rPr>
+    </w:lvl>
+    <w:lvl w:ilvl="5" w:tentative="1">
+      <w:start w:val="1"/>
+      <w:numFmt w:val="bullet"/>
+      <w:lvlText w:val=""/>
+      <w:lvlJc w:val="left"/>
+      <w:pPr>
+        <w:tabs>
+          <w:tab w:val="num" w:pos="4320"/>
+        </w:tabs>
+        <w:ind w:left="4320" w:hanging="360"/>
+      </w:pPr>
+      <w:rPr>
+        <w:rFonts w:ascii="Wingdings" w:hAnsi="Wingdings" w:hint="default"/>
+        <w:sz w:val="20"/>
+      </w:rPr>
+    </w:lvl>
+    <w:lvl w:ilvl="6" w:tentative="1">
+      <w:start w:val="1"/>
+      <w:numFmt w:val="bullet"/>
+      <w:lvlText w:val=""/>
+      <w:lvlJc w:val="left"/>
+      <w:pPr>
+        <w:tabs>
+          <w:tab w:val="num" w:pos="5040"/>
+        </w:tabs>
+        <w:ind w:left="5040" w:hanging="360"/>
+      </w:pPr>
+      <w:rPr>
+        <w:rFonts w:ascii="Wingdings" w:hAnsi="Wingdings" w:hint="default"/>
+        <w:sz w:val="20"/>
+      </w:rPr>
+    </w:lvl>
+    <w:lvl w:ilvl="7" w:tentative="1">
+      <w:start w:val="1"/>
+      <w:numFmt w:val="bullet"/>
+      <w:lvlText w:val=""/>
+      <w:lvlJc w:val="left"/>
+      <w:pPr>
+        <w:tabs>
+          <w:tab w:val="num" w:pos="5760"/>
+        </w:tabs>
+        <w:ind w:left="5760" w:hanging="360"/>
+      </w:pPr>
+      <w:rPr>
+        <w:rFonts w:ascii="Wingdings" w:hAnsi="Wingdings" w:hint="default"/>
+        <w:sz w:val="20"/>
+      </w:rPr>
+    </w:lvl>
+    <w:lvl w:ilvl="8" w:tentative="1">
+      <w:start w:val="1"/>
+      <w:numFmt w:val="bullet"/>
+      <w:lvlText w:val=""/>
+      <w:lvlJc w:val="left"/>
+      <w:pPr>
+        <w:tabs>
+          <w:tab w:val="num" w:pos="6480"/>
+        </w:tabs>
+        <w:ind w:left="6480" w:hanging="360"/>
+      </w:pPr>
+      <w:rPr>
+        <w:rFonts w:ascii="Wingdings" w:hAnsi="Wingdings" w:hint="default"/>
+        <w:sz w:val="20"/>
+      </w:rPr>
+    </w:lvl>
+  </w:abstractNum>
+  <w:num w:numId="1" w16cid:durableId="698238537">
+    <w:abstractNumId w:val="0"/>
+  </w:num>
+</w:numbering>
 </file>
 
 <file path=word/styles.xml><?xml version="1.0" encoding="utf-8"?>
@@ -669,16 +972,16 @@
     <w:lsdException w:name="Unresolved Mention" w:semiHidden="1" w:unhideWhenUsed="1"/>
     <w:lsdException w:name="Smart Link" w:semiHidden="1" w:unhideWhenUsed="1"/>
   </w:latentStyles>
-  <w:style w:type="paragraph" w:default="1" w:styleId="Normal">
+  <w:style w:type="paragraph" w:default="1" w:styleId="Norml">
     <w:name w:val="Normal"/>
     <w:qFormat/>
     <w:rsid w:val="00DE18B3"/>
   </w:style>
-  <w:style w:type="paragraph" w:styleId="Heading1">
+  <w:style w:type="paragraph" w:styleId="Cmsor1">
     <w:name w:val="heading 1"/>
-    <w:basedOn w:val="Normal"/>
-    <w:next w:val="Normal"/>
-    <w:link w:val="Heading1Char"/>
+    <w:basedOn w:val="Norml"/>
+    <w:next w:val="Norml"/>
+    <w:link w:val="Cmsor1Char"/>
     <w:uiPriority w:val="9"/>
     <w:qFormat/>
     <w:rsid w:val="009554B2"/>
@@ -695,11 +998,11 @@
       <w:szCs w:val="40"/>
     </w:rPr>
   </w:style>
-  <w:style w:type="paragraph" w:styleId="Heading2">
+  <w:style w:type="paragraph" w:styleId="Cmsor2">
     <w:name w:val="heading 2"/>
-    <w:basedOn w:val="Normal"/>
-    <w:next w:val="Normal"/>
-    <w:link w:val="Heading2Char"/>
+    <w:basedOn w:val="Norml"/>
+    <w:next w:val="Norml"/>
+    <w:link w:val="Cmsor2Char"/>
     <w:uiPriority w:val="9"/>
     <w:semiHidden/>
     <w:unhideWhenUsed/>
@@ -718,11 +1021,11 @@
       <w:szCs w:val="32"/>
     </w:rPr>
   </w:style>
-  <w:style w:type="paragraph" w:styleId="Heading3">
+  <w:style w:type="paragraph" w:styleId="Cmsor3">
     <w:name w:val="heading 3"/>
-    <w:basedOn w:val="Normal"/>
-    <w:next w:val="Normal"/>
-    <w:link w:val="Heading3Char"/>
+    <w:basedOn w:val="Norml"/>
+    <w:next w:val="Norml"/>
+    <w:link w:val="Cmsor3Char"/>
     <w:uiPriority w:val="9"/>
     <w:semiHidden/>
     <w:unhideWhenUsed/>
@@ -741,11 +1044,11 @@
       <w:szCs w:val="28"/>
     </w:rPr>
   </w:style>
-  <w:style w:type="paragraph" w:styleId="Heading4">
+  <w:style w:type="paragraph" w:styleId="Cmsor4">
     <w:name w:val="heading 4"/>
-    <w:basedOn w:val="Normal"/>
-    <w:next w:val="Normal"/>
-    <w:link w:val="Heading4Char"/>
+    <w:basedOn w:val="Norml"/>
+    <w:next w:val="Norml"/>
+    <w:link w:val="Cmsor4Char"/>
     <w:uiPriority w:val="9"/>
     <w:semiHidden/>
     <w:unhideWhenUsed/>
@@ -764,11 +1067,11 @@
       <w:color w:val="0F4761" w:themeColor="accent1" w:themeShade="BF"/>
     </w:rPr>
   </w:style>
-  <w:style w:type="paragraph" w:styleId="Heading5">
+  <w:style w:type="paragraph" w:styleId="Cmsor5">
     <w:name w:val="heading 5"/>
-    <w:basedOn w:val="Normal"/>
-    <w:next w:val="Normal"/>
-    <w:link w:val="Heading5Char"/>
+    <w:basedOn w:val="Norml"/>
+    <w:next w:val="Norml"/>
+    <w:link w:val="Cmsor5Char"/>
     <w:uiPriority w:val="9"/>
     <w:semiHidden/>
     <w:unhideWhenUsed/>
@@ -785,11 +1088,11 @@
       <w:color w:val="0F4761" w:themeColor="accent1" w:themeShade="BF"/>
     </w:rPr>
   </w:style>
-  <w:style w:type="paragraph" w:styleId="Heading6">
+  <w:style w:type="paragraph" w:styleId="Cmsor6">
     <w:name w:val="heading 6"/>
-    <w:basedOn w:val="Normal"/>
-    <w:next w:val="Normal"/>
-    <w:link w:val="Heading6Char"/>
+    <w:basedOn w:val="Norml"/>
+    <w:next w:val="Norml"/>
+    <w:link w:val="Cmsor6Char"/>
     <w:uiPriority w:val="9"/>
     <w:semiHidden/>
     <w:unhideWhenUsed/>
@@ -808,11 +1111,11 @@
       <w:color w:val="595959" w:themeColor="text1" w:themeTint="A6"/>
     </w:rPr>
   </w:style>
-  <w:style w:type="paragraph" w:styleId="Heading7">
+  <w:style w:type="paragraph" w:styleId="Cmsor7">
     <w:name w:val="heading 7"/>
-    <w:basedOn w:val="Normal"/>
-    <w:next w:val="Normal"/>
-    <w:link w:val="Heading7Char"/>
+    <w:basedOn w:val="Norml"/>
+    <w:next w:val="Norml"/>
+    <w:link w:val="Cmsor7Char"/>
     <w:uiPriority w:val="9"/>
     <w:semiHidden/>
     <w:unhideWhenUsed/>
@@ -829,11 +1132,11 @@
       <w:color w:val="595959" w:themeColor="text1" w:themeTint="A6"/>
     </w:rPr>
   </w:style>
-  <w:style w:type="paragraph" w:styleId="Heading8">
+  <w:style w:type="paragraph" w:styleId="Cmsor8">
     <w:name w:val="heading 8"/>
-    <w:basedOn w:val="Normal"/>
-    <w:next w:val="Normal"/>
-    <w:link w:val="Heading8Char"/>
+    <w:basedOn w:val="Norml"/>
+    <w:next w:val="Norml"/>
+    <w:link w:val="Cmsor8Char"/>
     <w:uiPriority w:val="9"/>
     <w:semiHidden/>
     <w:unhideWhenUsed/>
@@ -852,11 +1155,11 @@
       <w:color w:val="272727" w:themeColor="text1" w:themeTint="D8"/>
     </w:rPr>
   </w:style>
-  <w:style w:type="paragraph" w:styleId="Heading9">
+  <w:style w:type="paragraph" w:styleId="Cmsor9">
     <w:name w:val="heading 9"/>
-    <w:basedOn w:val="Normal"/>
-    <w:next w:val="Normal"/>
-    <w:link w:val="Heading9Char"/>
+    <w:basedOn w:val="Norml"/>
+    <w:next w:val="Norml"/>
+    <w:link w:val="Cmsor9Char"/>
     <w:uiPriority w:val="9"/>
     <w:semiHidden/>
     <w:unhideWhenUsed/>
@@ -873,13 +1176,13 @@
       <w:color w:val="272727" w:themeColor="text1" w:themeTint="D8"/>
     </w:rPr>
   </w:style>
-  <w:style w:type="character" w:default="1" w:styleId="DefaultParagraphFont">
+  <w:style w:type="character" w:default="1" w:styleId="Bekezdsalapbettpusa">
     <w:name w:val="Default Paragraph Font"/>
     <w:uiPriority w:val="1"/>
     <w:semiHidden/>
     <w:unhideWhenUsed/>
   </w:style>
-  <w:style w:type="table" w:default="1" w:styleId="TableNormal">
+  <w:style w:type="table" w:default="1" w:styleId="Normltblzat">
     <w:name w:val="Normal Table"/>
     <w:uiPriority w:val="99"/>
     <w:semiHidden/>
@@ -894,16 +1197,16 @@
       </w:tblCellMar>
     </w:tblPr>
   </w:style>
-  <w:style w:type="numbering" w:default="1" w:styleId="NoList">
+  <w:style w:type="numbering" w:default="1" w:styleId="Nemlista">
     <w:name w:val="No List"/>
     <w:uiPriority w:val="99"/>
     <w:semiHidden/>
     <w:unhideWhenUsed/>
   </w:style>
-  <w:style w:type="character" w:customStyle="1" w:styleId="Heading1Char">
-    <w:name w:val="Heading 1 Char"/>
-    <w:basedOn w:val="DefaultParagraphFont"/>
-    <w:link w:val="Heading1"/>
+  <w:style w:type="character" w:customStyle="1" w:styleId="Cmsor1Char">
+    <w:name w:val="Címsor 1 Char"/>
+    <w:basedOn w:val="Bekezdsalapbettpusa"/>
+    <w:link w:val="Cmsor1"/>
     <w:uiPriority w:val="9"/>
     <w:rsid w:val="009554B2"/>
     <w:rPr>
@@ -913,10 +1216,10 @@
       <w:szCs w:val="40"/>
     </w:rPr>
   </w:style>
-  <w:style w:type="character" w:customStyle="1" w:styleId="Heading2Char">
-    <w:name w:val="Heading 2 Char"/>
-    <w:basedOn w:val="DefaultParagraphFont"/>
-    <w:link w:val="Heading2"/>
+  <w:style w:type="character" w:customStyle="1" w:styleId="Cmsor2Char">
+    <w:name w:val="Címsor 2 Char"/>
+    <w:basedOn w:val="Bekezdsalapbettpusa"/>
+    <w:link w:val="Cmsor2"/>
     <w:uiPriority w:val="9"/>
     <w:semiHidden/>
     <w:rsid w:val="009554B2"/>
@@ -927,10 +1230,10 @@
       <w:szCs w:val="32"/>
     </w:rPr>
   </w:style>
-  <w:style w:type="character" w:customStyle="1" w:styleId="Heading3Char">
-    <w:name w:val="Heading 3 Char"/>
-    <w:basedOn w:val="DefaultParagraphFont"/>
-    <w:link w:val="Heading3"/>
+  <w:style w:type="character" w:customStyle="1" w:styleId="Cmsor3Char">
+    <w:name w:val="Címsor 3 Char"/>
+    <w:basedOn w:val="Bekezdsalapbettpusa"/>
+    <w:link w:val="Cmsor3"/>
     <w:uiPriority w:val="9"/>
     <w:semiHidden/>
     <w:rsid w:val="009554B2"/>
@@ -941,10 +1244,10 @@
       <w:szCs w:val="28"/>
     </w:rPr>
   </w:style>
-  <w:style w:type="character" w:customStyle="1" w:styleId="Heading4Char">
-    <w:name w:val="Heading 4 Char"/>
-    <w:basedOn w:val="DefaultParagraphFont"/>
-    <w:link w:val="Heading4"/>
+  <w:style w:type="character" w:customStyle="1" w:styleId="Cmsor4Char">
+    <w:name w:val="Címsor 4 Char"/>
+    <w:basedOn w:val="Bekezdsalapbettpusa"/>
+    <w:link w:val="Cmsor4"/>
     <w:uiPriority w:val="9"/>
     <w:semiHidden/>
     <w:rsid w:val="009554B2"/>
@@ -955,10 +1258,10 @@
       <w:color w:val="0F4761" w:themeColor="accent1" w:themeShade="BF"/>
     </w:rPr>
   </w:style>
-  <w:style w:type="character" w:customStyle="1" w:styleId="Heading5Char">
-    <w:name w:val="Heading 5 Char"/>
-    <w:basedOn w:val="DefaultParagraphFont"/>
-    <w:link w:val="Heading5"/>
+  <w:style w:type="character" w:customStyle="1" w:styleId="Cmsor5Char">
+    <w:name w:val="Címsor 5 Char"/>
+    <w:basedOn w:val="Bekezdsalapbettpusa"/>
+    <w:link w:val="Cmsor5"/>
     <w:uiPriority w:val="9"/>
     <w:semiHidden/>
     <w:rsid w:val="009554B2"/>
@@ -967,10 +1270,10 @@
       <w:color w:val="0F4761" w:themeColor="accent1" w:themeShade="BF"/>
     </w:rPr>
   </w:style>
-  <w:style w:type="character" w:customStyle="1" w:styleId="Heading6Char">
-    <w:name w:val="Heading 6 Char"/>
-    <w:basedOn w:val="DefaultParagraphFont"/>
-    <w:link w:val="Heading6"/>
+  <w:style w:type="character" w:customStyle="1" w:styleId="Cmsor6Char">
+    <w:name w:val="Címsor 6 Char"/>
+    <w:basedOn w:val="Bekezdsalapbettpusa"/>
+    <w:link w:val="Cmsor6"/>
     <w:uiPriority w:val="9"/>
     <w:semiHidden/>
     <w:rsid w:val="009554B2"/>
@@ -981,10 +1284,10 @@
       <w:color w:val="595959" w:themeColor="text1" w:themeTint="A6"/>
     </w:rPr>
   </w:style>
-  <w:style w:type="character" w:customStyle="1" w:styleId="Heading7Char">
-    <w:name w:val="Heading 7 Char"/>
-    <w:basedOn w:val="DefaultParagraphFont"/>
-    <w:link w:val="Heading7"/>
+  <w:style w:type="character" w:customStyle="1" w:styleId="Cmsor7Char">
+    <w:name w:val="Címsor 7 Char"/>
+    <w:basedOn w:val="Bekezdsalapbettpusa"/>
+    <w:link w:val="Cmsor7"/>
     <w:uiPriority w:val="9"/>
     <w:semiHidden/>
     <w:rsid w:val="009554B2"/>
@@ -993,10 +1296,10 @@
       <w:color w:val="595959" w:themeColor="text1" w:themeTint="A6"/>
     </w:rPr>
   </w:style>
-  <w:style w:type="character" w:customStyle="1" w:styleId="Heading8Char">
-    <w:name w:val="Heading 8 Char"/>
-    <w:basedOn w:val="DefaultParagraphFont"/>
-    <w:link w:val="Heading8"/>
+  <w:style w:type="character" w:customStyle="1" w:styleId="Cmsor8Char">
+    <w:name w:val="Címsor 8 Char"/>
+    <w:basedOn w:val="Bekezdsalapbettpusa"/>
+    <w:link w:val="Cmsor8"/>
     <w:uiPriority w:val="9"/>
     <w:semiHidden/>
     <w:rsid w:val="009554B2"/>
@@ -1007,10 +1310,10 @@
       <w:color w:val="272727" w:themeColor="text1" w:themeTint="D8"/>
     </w:rPr>
   </w:style>
-  <w:style w:type="character" w:customStyle="1" w:styleId="Heading9Char">
-    <w:name w:val="Heading 9 Char"/>
-    <w:basedOn w:val="DefaultParagraphFont"/>
-    <w:link w:val="Heading9"/>
+  <w:style w:type="character" w:customStyle="1" w:styleId="Cmsor9Char">
+    <w:name w:val="Címsor 9 Char"/>
+    <w:basedOn w:val="Bekezdsalapbettpusa"/>
+    <w:link w:val="Cmsor9"/>
     <w:uiPriority w:val="9"/>
     <w:semiHidden/>
     <w:rsid w:val="009554B2"/>
@@ -1019,11 +1322,11 @@
       <w:color w:val="272727" w:themeColor="text1" w:themeTint="D8"/>
     </w:rPr>
   </w:style>
-  <w:style w:type="paragraph" w:styleId="Title">
+  <w:style w:type="paragraph" w:styleId="Cm">
     <w:name w:val="Title"/>
-    <w:basedOn w:val="Normal"/>
-    <w:next w:val="Normal"/>
-    <w:link w:val="TitleChar"/>
+    <w:basedOn w:val="Norml"/>
+    <w:next w:val="Norml"/>
+    <w:link w:val="CmChar"/>
     <w:uiPriority w:val="10"/>
     <w:qFormat/>
     <w:rsid w:val="009554B2"/>
@@ -1039,10 +1342,10 @@
       <w:szCs w:val="56"/>
     </w:rPr>
   </w:style>
-  <w:style w:type="character" w:customStyle="1" w:styleId="TitleChar">
-    <w:name w:val="Title Char"/>
-    <w:basedOn w:val="DefaultParagraphFont"/>
-    <w:link w:val="Title"/>
+  <w:style w:type="character" w:customStyle="1" w:styleId="CmChar">
+    <w:name w:val="Cím Char"/>
+    <w:basedOn w:val="Bekezdsalapbettpusa"/>
+    <w:link w:val="Cm"/>
     <w:uiPriority w:val="10"/>
     <w:rsid w:val="009554B2"/>
     <w:rPr>
@@ -1053,11 +1356,11 @@
       <w:szCs w:val="56"/>
     </w:rPr>
   </w:style>
-  <w:style w:type="paragraph" w:styleId="Subtitle">
+  <w:style w:type="paragraph" w:styleId="Alcm">
     <w:name w:val="Subtitle"/>
-    <w:basedOn w:val="Normal"/>
-    <w:next w:val="Normal"/>
-    <w:link w:val="SubtitleChar"/>
+    <w:basedOn w:val="Norml"/>
+    <w:next w:val="Norml"/>
+    <w:link w:val="AlcmChar"/>
     <w:uiPriority w:val="11"/>
     <w:qFormat/>
     <w:rsid w:val="009554B2"/>
@@ -1074,10 +1377,10 @@
       <w:szCs w:val="28"/>
     </w:rPr>
   </w:style>
-  <w:style w:type="character" w:customStyle="1" w:styleId="SubtitleChar">
-    <w:name w:val="Subtitle Char"/>
-    <w:basedOn w:val="DefaultParagraphFont"/>
-    <w:link w:val="Subtitle"/>
+  <w:style w:type="character" w:customStyle="1" w:styleId="AlcmChar">
+    <w:name w:val="Alcím Char"/>
+    <w:basedOn w:val="Bekezdsalapbettpusa"/>
+    <w:link w:val="Alcm"/>
     <w:uiPriority w:val="11"/>
     <w:rsid w:val="009554B2"/>
     <w:rPr>
@@ -1088,11 +1391,11 @@
       <w:szCs w:val="28"/>
     </w:rPr>
   </w:style>
-  <w:style w:type="paragraph" w:styleId="Quote">
+  <w:style w:type="paragraph" w:styleId="Idzet">
     <w:name w:val="Quote"/>
-    <w:basedOn w:val="Normal"/>
-    <w:next w:val="Normal"/>
-    <w:link w:val="QuoteChar"/>
+    <w:basedOn w:val="Norml"/>
+    <w:next w:val="Norml"/>
+    <w:link w:val="IdzetChar"/>
     <w:uiPriority w:val="29"/>
     <w:qFormat/>
     <w:rsid w:val="009554B2"/>
@@ -1106,10 +1409,10 @@
       <w:color w:val="404040" w:themeColor="text1" w:themeTint="BF"/>
     </w:rPr>
   </w:style>
-  <w:style w:type="character" w:customStyle="1" w:styleId="QuoteChar">
-    <w:name w:val="Quote Char"/>
-    <w:basedOn w:val="DefaultParagraphFont"/>
-    <w:link w:val="Quote"/>
+  <w:style w:type="character" w:customStyle="1" w:styleId="IdzetChar">
+    <w:name w:val="Idézet Char"/>
+    <w:basedOn w:val="Bekezdsalapbettpusa"/>
+    <w:link w:val="Idzet"/>
     <w:uiPriority w:val="29"/>
     <w:rsid w:val="009554B2"/>
     <w:rPr>
@@ -1118,9 +1421,9 @@
       <w:color w:val="404040" w:themeColor="text1" w:themeTint="BF"/>
     </w:rPr>
   </w:style>
-  <w:style w:type="paragraph" w:styleId="ListParagraph">
+  <w:style w:type="paragraph" w:styleId="Listaszerbekezds">
     <w:name w:val="List Paragraph"/>
-    <w:basedOn w:val="Normal"/>
+    <w:basedOn w:val="Norml"/>
     <w:uiPriority w:val="34"/>
     <w:qFormat/>
     <w:rsid w:val="009554B2"/>
@@ -1129,9 +1432,9 @@
       <w:contextualSpacing/>
     </w:pPr>
   </w:style>
-  <w:style w:type="character" w:styleId="IntenseEmphasis">
+  <w:style w:type="character" w:styleId="Erskiemels">
     <w:name w:val="Intense Emphasis"/>
-    <w:basedOn w:val="DefaultParagraphFont"/>
+    <w:basedOn w:val="Bekezdsalapbettpusa"/>
     <w:uiPriority w:val="21"/>
     <w:qFormat/>
     <w:rsid w:val="009554B2"/>
@@ -1141,11 +1444,11 @@
       <w:color w:val="0F4761" w:themeColor="accent1" w:themeShade="BF"/>
     </w:rPr>
   </w:style>
-  <w:style w:type="paragraph" w:styleId="IntenseQuote">
+  <w:style w:type="paragraph" w:styleId="Kiemeltidzet">
     <w:name w:val="Intense Quote"/>
-    <w:basedOn w:val="Normal"/>
-    <w:next w:val="Normal"/>
-    <w:link w:val="IntenseQuoteChar"/>
+    <w:basedOn w:val="Norml"/>
+    <w:next w:val="Norml"/>
+    <w:link w:val="KiemeltidzetChar"/>
     <w:uiPriority w:val="30"/>
     <w:qFormat/>
     <w:rsid w:val="009554B2"/>
@@ -1164,10 +1467,10 @@
       <w:color w:val="0F4761" w:themeColor="accent1" w:themeShade="BF"/>
     </w:rPr>
   </w:style>
-  <w:style w:type="character" w:customStyle="1" w:styleId="IntenseQuoteChar">
-    <w:name w:val="Intense Quote Char"/>
-    <w:basedOn w:val="DefaultParagraphFont"/>
-    <w:link w:val="IntenseQuote"/>
+  <w:style w:type="character" w:customStyle="1" w:styleId="KiemeltidzetChar">
+    <w:name w:val="Kiemelt idézet Char"/>
+    <w:basedOn w:val="Bekezdsalapbettpusa"/>
+    <w:link w:val="Kiemeltidzet"/>
     <w:uiPriority w:val="30"/>
     <w:rsid w:val="009554B2"/>
     <w:rPr>
@@ -1176,9 +1479,9 @@
       <w:color w:val="0F4761" w:themeColor="accent1" w:themeShade="BF"/>
     </w:rPr>
   </w:style>
-  <w:style w:type="character" w:styleId="IntenseReference">
+  <w:style w:type="character" w:styleId="Ershivatkozs">
     <w:name w:val="Intense Reference"/>
-    <w:basedOn w:val="DefaultParagraphFont"/>
+    <w:basedOn w:val="Bekezdsalapbettpusa"/>
     <w:uiPriority w:val="32"/>
     <w:qFormat/>
     <w:rsid w:val="009554B2"/>
@@ -1190,9 +1493,9 @@
       <w:spacing w:val="5"/>
     </w:rPr>
   </w:style>
-  <w:style w:type="table" w:styleId="TableGrid">
+  <w:style w:type="table" w:styleId="Rcsostblzat">
     <w:name w:val="Table Grid"/>
-    <w:basedOn w:val="TableNormal"/>
+    <w:basedOn w:val="Normltblzat"/>
     <w:uiPriority w:val="39"/>
     <w:rsid w:val="00DE18B3"/>
     <w:pPr>
@@ -1209,9 +1512,9 @@
       </w:tblBorders>
     </w:tblPr>
   </w:style>
-  <w:style w:type="character" w:styleId="Hyperlink">
+  <w:style w:type="character" w:styleId="Hiperhivatkozs">
     <w:name w:val="Hyperlink"/>
-    <w:basedOn w:val="DefaultParagraphFont"/>
+    <w:basedOn w:val="Bekezdsalapbettpusa"/>
     <w:uiPriority w:val="99"/>
     <w:unhideWhenUsed/>
     <w:rsid w:val="00DE18B3"/>
@@ -1220,9 +1523,9 @@
       <w:u w:val="single"/>
     </w:rPr>
   </w:style>
-  <w:style w:type="character" w:styleId="UnresolvedMention">
+  <w:style w:type="character" w:styleId="Feloldatlanmegemlts">
     <w:name w:val="Unresolved Mention"/>
-    <w:basedOn w:val="DefaultParagraphFont"/>
+    <w:basedOn w:val="Bekezdsalapbettpusa"/>
     <w:uiPriority w:val="99"/>
     <w:semiHidden/>
     <w:unhideWhenUsed/>

</xml_diff>